<commit_message>
Relabel step-4 field to CUbatch.exe (v0.12)
The merge ran headlessly once pointed at CUbatch.exe, but the field was still
labelled 'CUupdate exe (or run_batch.py)' -- naming the two paths that DON'T work
on a Python-less server (CUupdate.exe is the GUI build; run_batch.py needs
Python) and omitting the one that does. Relabel to 'CUbatch.exe (or
run_batch.py)'. Updated the matching references in the triage manual (md + docx
rebuilt) and CUupdate BUILD.md. Version 0.11 -> 0.12.
</commit_message>
<xml_diff>
--- a/triage/USER_MANUAL.docx
+++ b/triage/USER_MANUAL.docx
@@ -1181,7 +1181,7 @@
           <w:b/>
           <w:bCs/>
         </w:rPr>
-        <w:t xml:space="preserve">CUupdate exe (or run_batch.py)</w:t>
+        <w:t xml:space="preserve">CUbatch.exe (or run_batch.py)</w:t>
       </w:r>
       <w:r>
         <w:t xml:space="preserve"> — see section 3.</w:t>
@@ -1536,7 +1536,7 @@
           <w:b/>
           <w:bCs/>
         </w:rPr>
-        <w:t xml:space="preserve">CUupdate exe (or run_batch.py)</w:t>
+        <w:t xml:space="preserve">CUbatch.exe (or run_batch.py)</w:t>
       </w:r>
       <w:r>
         <w:t xml:space="preserve"> field at one of:</w:t>

</xml_diff>

<commit_message>
Pipeline step 6: join + import to customer DB (triage v0.13)
Add a sixth pipeline step that joins every object file in the job root's
Import/ folder into one combined file and imports it into the customer SQL
database (overwrite, no schema sync, import only -- compile left to the dev).

- Join-And-Import.ps1: parameterised join+import, SQL-direct target
  (DatabaseServer + DatabaseName), ConfirmPreference=None + -Force, exit 0/1.
  Imports whatever is in the folder regardless of still-missing manual objects.
- pipeline.join_and_import(): frozen-aware script locator + subprocess shell,
  mirrors split_hq_file's (ok, output) contract.
- triage_gui: '6. Join + import to customer DB' button, confirm dialog, reuses
  the SQL server + Customer DB inputs already on the tab (no new fields).
- triage.spec: bundle Join-And-Import.ps1 into the frozen exe.
- USER_MANUAL .md/.docx: new section 2.7, five->six steps; docx rebuilt.

Tests: pipeline + triage suites green.
</commit_message>
<xml_diff>
--- a/triage/USER_MANUAL.docx
+++ b/triage/USER_MANUAL.docx
@@ -474,6 +474,7 @@
               <w:tab w:val="right" w:leader="dot" w:pos="9360"/>
             </w:tabs>
             <w:spacing w:after="40"/>
+            <w:ind w:left="360"/>
             <w:rPr>
               <w:noProof/>
             </w:rPr>
@@ -483,7 +484,7 @@
               <w:rPr>
                 <w:noProof/>
               </w:rPr>
-              <w:t xml:space="preserve">3. Running the merge: the batch exe vs run_batch.py</w:t>
+              <w:t xml:space="preserve">2.7 Step 6 — Join + import to customer DB</w:t>
             </w:r>
           </w:hyperlink>
           <w:r>
@@ -516,7 +517,7 @@
               <w:rPr>
                 <w:noProof/>
               </w:rPr>
-              <w:t xml:space="preserve">4. Date formats</w:t>
+              <w:t xml:space="preserve">3. Running the merge: the batch exe vs run_batch.py</w:t>
             </w:r>
           </w:hyperlink>
           <w:r>
@@ -549,7 +550,7 @@
               <w:rPr>
                 <w:noProof/>
               </w:rPr>
-              <w:t xml:space="preserve">5. The Baseline triage tab</w:t>
+              <w:t xml:space="preserve">4. Date formats</w:t>
             </w:r>
           </w:hyperlink>
           <w:r>
@@ -582,7 +583,7 @@
               <w:rPr>
                 <w:noProof/>
               </w:rPr>
-              <w:t xml:space="preserve">6. Progress and output</w:t>
+              <w:t xml:space="preserve">5. The Baseline triage tab</w:t>
             </w:r>
           </w:hyperlink>
           <w:r>
@@ -615,7 +616,7 @@
               <w:rPr>
                 <w:noProof/>
               </w:rPr>
-              <w:t xml:space="preserve">7. What runs where, and security</w:t>
+              <w:t xml:space="preserve">6. Progress and output</w:t>
             </w:r>
           </w:hyperlink>
           <w:r>
@@ -629,7 +630,40 @@
               <w:rPr>
                 <w:noProof/>
               </w:rPr>
-              <w:t>4</w:t>
+              <w:t>5</w:t>
+            </w:r>
+          </w:hyperlink>
+        </w:p>
+        <w:p>
+          <w:pPr>
+            <w:tabs>
+              <w:tab w:val="right" w:leader="dot" w:pos="9360"/>
+            </w:tabs>
+            <w:spacing w:after="40"/>
+            <w:rPr>
+              <w:noProof/>
+            </w:rPr>
+          </w:pPr>
+          <w:hyperlink w:anchor="_Toc_cu_17">
+            <w:r>
+              <w:rPr>
+                <w:noProof/>
+              </w:rPr>
+              <w:t xml:space="preserve">7. What runs where, and security</w:t>
+            </w:r>
+          </w:hyperlink>
+          <w:r>
+            <w:rPr>
+              <w:noProof/>
+            </w:rPr>
+            <w:tab/>
+          </w:r>
+          <w:hyperlink w:anchor="_Toc_cu_17">
+            <w:r>
+              <w:rPr>
+                <w:noProof/>
+              </w:rPr>
+              <w:t>5</w:t>
             </w:r>
           </w:hyperlink>
         </w:p>
@@ -650,7 +684,7 @@
         <w:spacing w:after="120"/>
       </w:pPr>
       <w:r>
-        <w:t xml:space="preserve">Version 0.11</w:t>
+        <w:t xml:space="preserve">Version 0.13</w:t>
       </w:r>
     </w:p>
     <w:p>
@@ -944,7 +978,7 @@
         <w:spacing w:after="120"/>
       </w:pPr>
       <w:r>
-        <w:t xml:space="preserve">The pipeline runs as five explicit steps so each one's result is visible before the next. Fill in the inputs at the top, then click the step buttons in order.</w:t>
+        <w:t xml:space="preserve">The pipeline runs as six explicit steps so each one's result is visible before the next. Fill in the inputs at the top, then click the step buttons in order.</w:t>
       </w:r>
     </w:p>
     <w:p>
@@ -1516,13 +1550,94 @@
     </w:p>
     <w:p>
       <w:pPr>
+        <w:pStyle w:val="Heading2"/>
+      </w:pPr>
+      <w:bookmarkStart w:id="9012" w:name="_Toc_cu_12"/>
+      <w:r>
+        <w:t xml:space="preserve">2.7 Step 6 — Join + import to customer DB</w:t>
+      </w:r>
+      <w:bookmarkEnd w:id="9012"/>
+    </w:p>
+    <w:p>
+      <w:pPr>
+        <w:spacing w:after="120"/>
+      </w:pPr>
+      <w:r>
+        <w:t xml:space="preserve">Joins every object file in the </w:t>
+      </w:r>
+      <w:r>
+        <w:rPr>
+          <w:rFonts w:ascii="Consolas" w:cs="Consolas" w:eastAsia="Consolas" w:hAnsi="Consolas"/>
+        </w:rPr>
+        <w:t xml:space="preserve">Import/</w:t>
+      </w:r>
+      <w:r>
+        <w:t xml:space="preserve"> folder into one combined file (</w:t>
+      </w:r>
+      <w:r>
+        <w:rPr>
+          <w:rFonts w:ascii="Consolas" w:cs="Consolas" w:eastAsia="Consolas" w:hAnsi="Consolas"/>
+        </w:rPr>
+        <w:t xml:space="preserve">Import/joined/Combined.txt</w:t>
+      </w:r>
+      <w:r>
+        <w:t xml:space="preserve">) and imports it into the </w:t>
+      </w:r>
+      <w:r>
+        <w:rPr>
+          <w:b/>
+          <w:bCs/>
+        </w:rPr>
+        <w:t xml:space="preserve">customer</w:t>
+      </w:r>
+      <w:r>
+        <w:t xml:space="preserve"> database, overwriting existing objects. The target is the SQL server and Customer DB from the inputs at the top — the same connection used for the export, identified by SQL server and database name (not a NAV service-tier instance).</w:t>
+      </w:r>
+    </w:p>
+    <w:p>
+      <w:pPr>
+        <w:spacing w:after="120"/>
+      </w:pPr>
+      <w:r>
+        <w:t xml:space="preserve">The import uses </w:t>
+      </w:r>
+      <w:r>
+        <w:rPr>
+          <w:b/>
+          <w:bCs/>
+        </w:rPr>
+        <w:t xml:space="preserve">overwrite, no schema synchronisation, and does not compile</w:t>
+      </w:r>
+      <w:r>
+        <w:t xml:space="preserve"> — compiling is left to you in the dev environment, where you control the order (tables before dependent pages) and can review errors.</w:t>
+      </w:r>
+    </w:p>
+    <w:p>
+      <w:pPr>
+        <w:spacing w:after="120"/>
+      </w:pPr>
+      <w:r>
+        <w:t xml:space="preserve">Whatever is in the </w:t>
+      </w:r>
+      <w:r>
+        <w:rPr>
+          <w:rFonts w:ascii="Consolas" w:cs="Consolas" w:eastAsia="Consolas" w:hAnsi="Consolas"/>
+        </w:rPr>
+        <w:t xml:space="preserve">Import/</w:t>
+      </w:r>
+      <w:r>
+        <w:t xml:space="preserve"> folder is imported, regardless of any objects still flagged manual-required from step 5 — so you can import the ready set and add the hand-merged objects in a later pass. The step asks for confirmation first, showing the folder and target database. It runs under Windows authentication; no credentials are entered or stored.</w:t>
+      </w:r>
+    </w:p>
+    <w:p>
+      <w:pPr>
         <w:pStyle w:val="Heading1"/>
       </w:pPr>
-      <w:bookmarkStart w:id="9012" w:name="_Toc_cu_12"/>
+      <w:bookmarkStart w:id="9013" w:name="_Toc_cu_13"/>
       <w:r>
         <w:t xml:space="preserve">3. Running the merge: the batch exe vs run_batch.py</w:t>
       </w:r>
-      <w:bookmarkEnd w:id="9012"/>
+      <w:bookmarkEnd w:id="9013"/>
     </w:p>
     <w:p>
       <w:pPr>
@@ -1649,11 +1764,11 @@
       <w:pPr>
         <w:pStyle w:val="Heading1"/>
       </w:pPr>
-      <w:bookmarkStart w:id="9013" w:name="_Toc_cu_13"/>
+      <w:bookmarkStart w:id="9014" w:name="_Toc_cu_14"/>
       <w:r>
         <w:t xml:space="preserve">4. Date formats</w:t>
       </w:r>
-      <w:bookmarkEnd w:id="9013"/>
+      <w:bookmarkEnd w:id="9014"/>
     </w:p>
     <w:p>
       <w:pPr>
@@ -1683,11 +1798,11 @@
       <w:pPr>
         <w:pStyle w:val="Heading1"/>
       </w:pPr>
-      <w:bookmarkStart w:id="9014" w:name="_Toc_cu_14"/>
+      <w:bookmarkStart w:id="9015" w:name="_Toc_cu_15"/>
       <w:r>
         <w:t xml:space="preserve">5. The Baseline triage tab</w:t>
       </w:r>
-      <w:bookmarkEnd w:id="9014"/>
+      <w:bookmarkEnd w:id="9015"/>
     </w:p>
     <w:p>
       <w:pPr>
@@ -1755,11 +1870,11 @@
       <w:pPr>
         <w:pStyle w:val="Heading1"/>
       </w:pPr>
-      <w:bookmarkStart w:id="9015" w:name="_Toc_cu_15"/>
+      <w:bookmarkStart w:id="9016" w:name="_Toc_cu_16"/>
       <w:r>
         <w:t xml:space="preserve">6. Progress and output</w:t>
       </w:r>
-      <w:bookmarkEnd w:id="9015"/>
+      <w:bookmarkEnd w:id="9016"/>
     </w:p>
     <w:p>
       <w:pPr>
@@ -1820,11 +1935,11 @@
       <w:pPr>
         <w:pStyle w:val="Heading1"/>
       </w:pPr>
-      <w:bookmarkStart w:id="9016" w:name="_Toc_cu_16"/>
+      <w:bookmarkStart w:id="9017" w:name="_Toc_cu_17"/>
       <w:r>
         <w:t xml:space="preserve">7. What runs where, and security</w:t>
       </w:r>
-      <w:bookmarkEnd w:id="9016"/>
+      <w:bookmarkEnd w:id="9017"/>
     </w:p>
     <w:p>
       <w:pPr>

</xml_diff>

<commit_message>
Add pipeline walkthrough screenshots to triage manual (v0.14)
Embed 15 step-by-step screenshots in the triage USER_MANUAL covering the
full CU Pipeline run: inputs (2.1), split (2.2), export + result folders
(2.3), classify + treatment report (2.4), stage/merge + manual-merge
workflow in TortoiseMerge (2.5), import set (2.6), and the step 6
join+import confirmation (2.7).

- triage/img/: 15 PNGs.
- USER_MANUAL.md: ![](img/...) refs with captions at each step.
- USER_MANUAL.docx rebuilt (images embedded, TOC page numbers baked).

Docs only; no behaviour change.
</commit_message>
<xml_diff>
--- a/triage/USER_MANUAL.docx
+++ b/triage/USER_MANUAL.docx
@@ -430,7 +430,7 @@
               <w:rPr>
                 <w:noProof/>
               </w:rPr>
-              <w:t>3</w:t>
+              <w:t>4</w:t>
             </w:r>
           </w:hyperlink>
         </w:p>
@@ -464,7 +464,7 @@
               <w:rPr>
                 <w:noProof/>
               </w:rPr>
-              <w:t>3</w:t>
+              <w:t>4</w:t>
             </w:r>
           </w:hyperlink>
         </w:p>
@@ -531,7 +531,7 @@
               <w:rPr>
                 <w:noProof/>
               </w:rPr>
-              <w:t>4</w:t>
+              <w:t>5</w:t>
             </w:r>
           </w:hyperlink>
         </w:p>
@@ -564,7 +564,7 @@
               <w:rPr>
                 <w:noProof/>
               </w:rPr>
-              <w:t>4</w:t>
+              <w:t>5</w:t>
             </w:r>
           </w:hyperlink>
         </w:p>
@@ -597,7 +597,7 @@
               <w:rPr>
                 <w:noProof/>
               </w:rPr>
-              <w:t>4</w:t>
+              <w:t>5</w:t>
             </w:r>
           </w:hyperlink>
         </w:p>
@@ -663,7 +663,7 @@
               <w:rPr>
                 <w:noProof/>
               </w:rPr>
-              <w:t>5</w:t>
+              <w:t>6</w:t>
             </w:r>
           </w:hyperlink>
         </w:p>
@@ -684,7 +684,7 @@
         <w:spacing w:after="120"/>
       </w:pPr>
       <w:r>
-        <w:t xml:space="preserve">Version 0.13</w:t>
+        <w:t xml:space="preserve">Version 0.14</w:t>
       </w:r>
     </w:p>
     <w:p>
@@ -1249,6 +1249,68 @@
     </w:p>
     <w:p>
       <w:pPr>
+        <w:spacing w:after="40" w:before="120"/>
+        <w:jc w:val="center"/>
+      </w:pPr>
+      <w:r>
+        <w:drawing>
+          <wp:inline distT="0" distB="0" distL="0" distR="0">
+            <wp:extent cx="4572000" cy="299493460575"/>
+            <wp:effectExtent t="0" r="0" b="0" l="0"/>
+            <wp:docPr id="1" name="" descr="" title=""/>
+            <wp:cNvGraphicFramePr>
+              <a:graphicFrameLocks xmlns:a="http://schemas.openxmlformats.org/drawingml/2006/main" noChangeAspect="1"/>
+            </wp:cNvGraphicFramePr>
+            <a:graphic xmlns:a="http://schemas.openxmlformats.org/drawingml/2006/main">
+              <a:graphicData uri="http://schemas.openxmlformats.org/drawingml/2006/picture">
+                <pic:pic xmlns:pic="http://schemas.openxmlformats.org/drawingml/2006/picture">
+                  <pic:nvPicPr>
+                    <pic:cNvPr id="0" name="" descr=""/>
+                    <pic:cNvPicPr>
+                      <a:picLocks noChangeAspect="1" noChangeArrowheads="1"/>
+                    </pic:cNvPicPr>
+                  </pic:nvPicPr>
+                  <pic:blipFill>
+                    <a:blip r:embed="rId9" cstate="none"/>
+                    <a:srcRect/>
+                    <a:stretch>
+                      <a:fillRect/>
+                    </a:stretch>
+                  </pic:blipFill>
+                  <pic:spPr bwMode="auto">
+                    <a:xfrm>
+                      <a:off x="0" y="0"/>
+                      <a:ext cx="4572000" cy="299493460575"/>
+                    </a:xfrm>
+                    <a:prstGeom prst="rect">
+                      <a:avLst/>
+                    </a:prstGeom>
+                  </pic:spPr>
+                </pic:pic>
+              </a:graphicData>
+            </a:graphic>
+          </wp:inline>
+        </w:drawing>
+      </w:r>
+    </w:p>
+    <w:p>
+      <w:pPr>
+        <w:spacing w:after="160"/>
+        <w:jc w:val="center"/>
+      </w:pPr>
+      <w:r>
+        <w:rPr>
+          <w:i/>
+          <w:iCs/>
+          <w:color w:val="595959"/>
+          <w:sz w:val="18"/>
+          <w:szCs w:val="18"/>
+        </w:rPr>
+        <w:t xml:space="preserve">The CU Pipeline tab with the inputs and merge parameters filled in.</w:t>
+      </w:r>
+    </w:p>
+    <w:p>
+      <w:pPr>
         <w:pStyle w:val="Heading2"/>
       </w:pPr>
       <w:bookmarkStart w:id="9007" w:name="_Toc_cu_7"/>
@@ -1286,6 +1348,130 @@
       </w:r>
       <w:r>
         <w:t xml:space="preserve">) and lists the object keys found. No database connection needed.</w:t>
+      </w:r>
+    </w:p>
+    <w:p>
+      <w:pPr>
+        <w:spacing w:after="40" w:before="120"/>
+        <w:jc w:val="center"/>
+      </w:pPr>
+      <w:r>
+        <w:drawing>
+          <wp:inline distT="0" distB="0" distL="0" distR="0">
+            <wp:extent cx="4572000" cy="299493460575"/>
+            <wp:effectExtent t="0" r="0" b="0" l="0"/>
+            <wp:docPr id="1" name="" descr="" title=""/>
+            <wp:cNvGraphicFramePr>
+              <a:graphicFrameLocks xmlns:a="http://schemas.openxmlformats.org/drawingml/2006/main" noChangeAspect="1"/>
+            </wp:cNvGraphicFramePr>
+            <a:graphic xmlns:a="http://schemas.openxmlformats.org/drawingml/2006/main">
+              <a:graphicData uri="http://schemas.openxmlformats.org/drawingml/2006/picture">
+                <pic:pic xmlns:pic="http://schemas.openxmlformats.org/drawingml/2006/picture">
+                  <pic:nvPicPr>
+                    <pic:cNvPr id="0" name="" descr=""/>
+                    <pic:cNvPicPr>
+                      <a:picLocks noChangeAspect="1" noChangeArrowheads="1"/>
+                    </pic:cNvPicPr>
+                  </pic:nvPicPr>
+                  <pic:blipFill>
+                    <a:blip r:embed="rId10" cstate="none"/>
+                    <a:srcRect/>
+                    <a:stretch>
+                      <a:fillRect/>
+                    </a:stretch>
+                  </pic:blipFill>
+                  <pic:spPr bwMode="auto">
+                    <a:xfrm>
+                      <a:off x="0" y="0"/>
+                      <a:ext cx="4572000" cy="299493460575"/>
+                    </a:xfrm>
+                    <a:prstGeom prst="rect">
+                      <a:avLst/>
+                    </a:prstGeom>
+                  </pic:spPr>
+                </pic:pic>
+              </a:graphicData>
+            </a:graphic>
+          </wp:inline>
+        </w:drawing>
+      </w:r>
+    </w:p>
+    <w:p>
+      <w:pPr>
+        <w:spacing w:after="160"/>
+        <w:jc w:val="center"/>
+      </w:pPr>
+      <w:r>
+        <w:rPr>
+          <w:i/>
+          <w:iCs/>
+          <w:color w:val="595959"/>
+          <w:sz w:val="18"/>
+          <w:szCs w:val="18"/>
+        </w:rPr>
+        <w:t xml:space="preserve">The step 1 output: the split destination and the list of object keys found.</w:t>
+      </w:r>
+    </w:p>
+    <w:p>
+      <w:pPr>
+        <w:spacing w:after="40" w:before="120"/>
+        <w:jc w:val="center"/>
+      </w:pPr>
+      <w:r>
+        <w:drawing>
+          <wp:inline distT="0" distB="0" distL="0" distR="0">
+            <wp:extent cx="4572000" cy="299493460575"/>
+            <wp:effectExtent t="0" r="0" b="0" l="0"/>
+            <wp:docPr id="1" name="" descr="" title=""/>
+            <wp:cNvGraphicFramePr>
+              <a:graphicFrameLocks xmlns:a="http://schemas.openxmlformats.org/drawingml/2006/main" noChangeAspect="1"/>
+            </wp:cNvGraphicFramePr>
+            <a:graphic xmlns:a="http://schemas.openxmlformats.org/drawingml/2006/main">
+              <a:graphicData uri="http://schemas.openxmlformats.org/drawingml/2006/picture">
+                <pic:pic xmlns:pic="http://schemas.openxmlformats.org/drawingml/2006/picture">
+                  <pic:nvPicPr>
+                    <pic:cNvPr id="0" name="" descr=""/>
+                    <pic:cNvPicPr>
+                      <a:picLocks noChangeAspect="1" noChangeArrowheads="1"/>
+                    </pic:cNvPicPr>
+                  </pic:nvPicPr>
+                  <pic:blipFill>
+                    <a:blip r:embed="rId11" cstate="none"/>
+                    <a:srcRect/>
+                    <a:stretch>
+                      <a:fillRect/>
+                    </a:stretch>
+                  </pic:blipFill>
+                  <pic:spPr bwMode="auto">
+                    <a:xfrm>
+                      <a:off x="0" y="0"/>
+                      <a:ext cx="4572000" cy="299493460575"/>
+                    </a:xfrm>
+                    <a:prstGeom prst="rect">
+                      <a:avLst/>
+                    </a:prstGeom>
+                  </pic:spPr>
+                </pic:pic>
+              </a:graphicData>
+            </a:graphic>
+          </wp:inline>
+        </w:drawing>
+      </w:r>
+    </w:p>
+    <w:p>
+      <w:pPr>
+        <w:spacing w:after="160"/>
+        <w:jc w:val="center"/>
+      </w:pPr>
+      <w:r>
+        <w:rPr>
+          <w:i/>
+          <w:iCs/>
+          <w:color w:val="595959"/>
+          <w:sz w:val="18"/>
+          <w:szCs w:val="18"/>
+        </w:rPr>
+        <w:t xml:space="preserve">The hq/ folder after step 1: one CU-&lt;key&gt;.txt file per object.</w:t>
       </w:r>
     </w:p>
     <w:p>
@@ -1354,6 +1540,254 @@
     </w:p>
     <w:p>
       <w:pPr>
+        <w:spacing w:after="40" w:before="120"/>
+        <w:jc w:val="center"/>
+      </w:pPr>
+      <w:r>
+        <w:drawing>
+          <wp:inline distT="0" distB="0" distL="0" distR="0">
+            <wp:extent cx="4572000" cy="299493460575"/>
+            <wp:effectExtent t="0" r="0" b="0" l="0"/>
+            <wp:docPr id="1" name="" descr="" title=""/>
+            <wp:cNvGraphicFramePr>
+              <a:graphicFrameLocks xmlns:a="http://schemas.openxmlformats.org/drawingml/2006/main" noChangeAspect="1"/>
+            </wp:cNvGraphicFramePr>
+            <a:graphic xmlns:a="http://schemas.openxmlformats.org/drawingml/2006/main">
+              <a:graphicData uri="http://schemas.openxmlformats.org/drawingml/2006/picture">
+                <pic:pic xmlns:pic="http://schemas.openxmlformats.org/drawingml/2006/picture">
+                  <pic:nvPicPr>
+                    <pic:cNvPr id="0" name="" descr=""/>
+                    <pic:cNvPicPr>
+                      <a:picLocks noChangeAspect="1" noChangeArrowheads="1"/>
+                    </pic:cNvPicPr>
+                  </pic:nvPicPr>
+                  <pic:blipFill>
+                    <a:blip r:embed="rId12" cstate="none"/>
+                    <a:srcRect/>
+                    <a:stretch>
+                      <a:fillRect/>
+                    </a:stretch>
+                  </pic:blipFill>
+                  <pic:spPr bwMode="auto">
+                    <a:xfrm>
+                      <a:off x="0" y="0"/>
+                      <a:ext cx="4572000" cy="299493460575"/>
+                    </a:xfrm>
+                    <a:prstGeom prst="rect">
+                      <a:avLst/>
+                    </a:prstGeom>
+                  </pic:spPr>
+                </pic:pic>
+              </a:graphicData>
+            </a:graphic>
+          </wp:inline>
+        </w:drawing>
+      </w:r>
+    </w:p>
+    <w:p>
+      <w:pPr>
+        <w:spacing w:after="160"/>
+        <w:jc w:val="center"/>
+      </w:pPr>
+      <w:r>
+        <w:rPr>
+          <w:i/>
+          <w:iCs/>
+          <w:color w:val="595959"/>
+          <w:sz w:val="18"/>
+          <w:szCs w:val="18"/>
+        </w:rPr>
+        <w:t xml:space="preserve">The step 2 output: per-type export filters and the export of each object from the customer and old-baseline databases.</w:t>
+      </w:r>
+    </w:p>
+    <w:p>
+      <w:pPr>
+        <w:spacing w:after="40" w:before="120"/>
+        <w:jc w:val="center"/>
+      </w:pPr>
+      <w:r>
+        <w:drawing>
+          <wp:inline distT="0" distB="0" distL="0" distR="0">
+            <wp:extent cx="4572000" cy="299493460575"/>
+            <wp:effectExtent t="0" r="0" b="0" l="0"/>
+            <wp:docPr id="1" name="" descr="" title=""/>
+            <wp:cNvGraphicFramePr>
+              <a:graphicFrameLocks xmlns:a="http://schemas.openxmlformats.org/drawingml/2006/main" noChangeAspect="1"/>
+            </wp:cNvGraphicFramePr>
+            <a:graphic xmlns:a="http://schemas.openxmlformats.org/drawingml/2006/main">
+              <a:graphicData uri="http://schemas.openxmlformats.org/drawingml/2006/picture">
+                <pic:pic xmlns:pic="http://schemas.openxmlformats.org/drawingml/2006/picture">
+                  <pic:nvPicPr>
+                    <pic:cNvPr id="0" name="" descr=""/>
+                    <pic:cNvPicPr>
+                      <a:picLocks noChangeAspect="1" noChangeArrowheads="1"/>
+                    </pic:cNvPicPr>
+                  </pic:nvPicPr>
+                  <pic:blipFill>
+                    <a:blip r:embed="rId13" cstate="none"/>
+                    <a:srcRect/>
+                    <a:stretch>
+                      <a:fillRect/>
+                    </a:stretch>
+                  </pic:blipFill>
+                  <pic:spPr bwMode="auto">
+                    <a:xfrm>
+                      <a:off x="0" y="0"/>
+                      <a:ext cx="4572000" cy="299493460575"/>
+                    </a:xfrm>
+                    <a:prstGeom prst="rect">
+                      <a:avLst/>
+                    </a:prstGeom>
+                  </pic:spPr>
+                </pic:pic>
+              </a:graphicData>
+            </a:graphic>
+          </wp:inline>
+        </w:drawing>
+      </w:r>
+    </w:p>
+    <w:p>
+      <w:pPr>
+        <w:spacing w:after="160"/>
+        <w:jc w:val="center"/>
+      </w:pPr>
+      <w:r>
+        <w:rPr>
+          <w:i/>
+          <w:iCs/>
+          <w:color w:val="595959"/>
+          <w:sz w:val="18"/>
+          <w:szCs w:val="18"/>
+        </w:rPr>
+        <w:t xml:space="preserve">Step 2 produces the customer/ and oldbase/ folders alongside hq/.</w:t>
+      </w:r>
+    </w:p>
+    <w:p>
+      <w:pPr>
+        <w:spacing w:after="40" w:before="120"/>
+        <w:jc w:val="center"/>
+      </w:pPr>
+      <w:r>
+        <w:drawing>
+          <wp:inline distT="0" distB="0" distL="0" distR="0">
+            <wp:extent cx="4572000" cy="299493460575"/>
+            <wp:effectExtent t="0" r="0" b="0" l="0"/>
+            <wp:docPr id="1" name="" descr="" title=""/>
+            <wp:cNvGraphicFramePr>
+              <a:graphicFrameLocks xmlns:a="http://schemas.openxmlformats.org/drawingml/2006/main" noChangeAspect="1"/>
+            </wp:cNvGraphicFramePr>
+            <a:graphic xmlns:a="http://schemas.openxmlformats.org/drawingml/2006/main">
+              <a:graphicData uri="http://schemas.openxmlformats.org/drawingml/2006/picture">
+                <pic:pic xmlns:pic="http://schemas.openxmlformats.org/drawingml/2006/picture">
+                  <pic:nvPicPr>
+                    <pic:cNvPr id="0" name="" descr=""/>
+                    <pic:cNvPicPr>
+                      <a:picLocks noChangeAspect="1" noChangeArrowheads="1"/>
+                    </pic:cNvPicPr>
+                  </pic:nvPicPr>
+                  <pic:blipFill>
+                    <a:blip r:embed="rId14" cstate="none"/>
+                    <a:srcRect/>
+                    <a:stretch>
+                      <a:fillRect/>
+                    </a:stretch>
+                  </pic:blipFill>
+                  <pic:spPr bwMode="auto">
+                    <a:xfrm>
+                      <a:off x="0" y="0"/>
+                      <a:ext cx="4572000" cy="299493460575"/>
+                    </a:xfrm>
+                    <a:prstGeom prst="rect">
+                      <a:avLst/>
+                    </a:prstGeom>
+                  </pic:spPr>
+                </pic:pic>
+              </a:graphicData>
+            </a:graphic>
+          </wp:inline>
+        </w:drawing>
+      </w:r>
+    </w:p>
+    <w:p>
+      <w:pPr>
+        <w:spacing w:after="160"/>
+        <w:jc w:val="center"/>
+      </w:pPr>
+      <w:r>
+        <w:rPr>
+          <w:i/>
+          <w:iCs/>
+          <w:color w:val="595959"/>
+          <w:sz w:val="18"/>
+          <w:szCs w:val="18"/>
+        </w:rPr>
+        <w:t xml:space="preserve">The customer/ folder: each object exported with the EX- prefix.</w:t>
+      </w:r>
+    </w:p>
+    <w:p>
+      <w:pPr>
+        <w:spacing w:after="40" w:before="120"/>
+        <w:jc w:val="center"/>
+      </w:pPr>
+      <w:r>
+        <w:drawing>
+          <wp:inline distT="0" distB="0" distL="0" distR="0">
+            <wp:extent cx="4572000" cy="299493460575"/>
+            <wp:effectExtent t="0" r="0" b="0" l="0"/>
+            <wp:docPr id="1" name="" descr="" title=""/>
+            <wp:cNvGraphicFramePr>
+              <a:graphicFrameLocks xmlns:a="http://schemas.openxmlformats.org/drawingml/2006/main" noChangeAspect="1"/>
+            </wp:cNvGraphicFramePr>
+            <a:graphic xmlns:a="http://schemas.openxmlformats.org/drawingml/2006/main">
+              <a:graphicData uri="http://schemas.openxmlformats.org/drawingml/2006/picture">
+                <pic:pic xmlns:pic="http://schemas.openxmlformats.org/drawingml/2006/picture">
+                  <pic:nvPicPr>
+                    <pic:cNvPr id="0" name="" descr=""/>
+                    <pic:cNvPicPr>
+                      <a:picLocks noChangeAspect="1" noChangeArrowheads="1"/>
+                    </pic:cNvPicPr>
+                  </pic:nvPicPr>
+                  <pic:blipFill>
+                    <a:blip r:embed="rId15" cstate="none"/>
+                    <a:srcRect/>
+                    <a:stretch>
+                      <a:fillRect/>
+                    </a:stretch>
+                  </pic:blipFill>
+                  <pic:spPr bwMode="auto">
+                    <a:xfrm>
+                      <a:off x="0" y="0"/>
+                      <a:ext cx="4572000" cy="299493460575"/>
+                    </a:xfrm>
+                    <a:prstGeom prst="rect">
+                      <a:avLst/>
+                    </a:prstGeom>
+                  </pic:spPr>
+                </pic:pic>
+              </a:graphicData>
+            </a:graphic>
+          </wp:inline>
+        </w:drawing>
+      </w:r>
+    </w:p>
+    <w:p>
+      <w:pPr>
+        <w:spacing w:after="160"/>
+        <w:jc w:val="center"/>
+      </w:pPr>
+      <w:r>
+        <w:rPr>
+          <w:i/>
+          <w:iCs/>
+          <w:color w:val="595959"/>
+          <w:sz w:val="18"/>
+          <w:szCs w:val="18"/>
+        </w:rPr>
+        <w:t xml:space="preserve">The oldbase/ folder: the same objects from the old-baseline DB with the OB- prefix.</w:t>
+      </w:r>
+    </w:p>
+    <w:p>
+      <w:pPr>
         <w:pStyle w:val="Heading2"/>
       </w:pPr>
       <w:bookmarkStart w:id="9009" w:name="_Toc_cu_9"/>
@@ -1472,6 +1906,130 @@
     </w:p>
     <w:p>
       <w:pPr>
+        <w:spacing w:after="40" w:before="120"/>
+        <w:jc w:val="center"/>
+      </w:pPr>
+      <w:r>
+        <w:drawing>
+          <wp:inline distT="0" distB="0" distL="0" distR="0">
+            <wp:extent cx="4572000" cy="299493460575"/>
+            <wp:effectExtent t="0" r="0" b="0" l="0"/>
+            <wp:docPr id="1" name="" descr="" title=""/>
+            <wp:cNvGraphicFramePr>
+              <a:graphicFrameLocks xmlns:a="http://schemas.openxmlformats.org/drawingml/2006/main" noChangeAspect="1"/>
+            </wp:cNvGraphicFramePr>
+            <a:graphic xmlns:a="http://schemas.openxmlformats.org/drawingml/2006/main">
+              <a:graphicData uri="http://schemas.openxmlformats.org/drawingml/2006/picture">
+                <pic:pic xmlns:pic="http://schemas.openxmlformats.org/drawingml/2006/picture">
+                  <pic:nvPicPr>
+                    <pic:cNvPr id="0" name="" descr=""/>
+                    <pic:cNvPicPr>
+                      <a:picLocks noChangeAspect="1" noChangeArrowheads="1"/>
+                    </pic:cNvPicPr>
+                  </pic:nvPicPr>
+                  <pic:blipFill>
+                    <a:blip r:embed="rId16" cstate="none"/>
+                    <a:srcRect/>
+                    <a:stretch>
+                      <a:fillRect/>
+                    </a:stretch>
+                  </pic:blipFill>
+                  <pic:spPr bwMode="auto">
+                    <a:xfrm>
+                      <a:off x="0" y="0"/>
+                      <a:ext cx="4572000" cy="299493460575"/>
+                    </a:xfrm>
+                    <a:prstGeom prst="rect">
+                      <a:avLst/>
+                    </a:prstGeom>
+                  </pic:spPr>
+                </pic:pic>
+              </a:graphicData>
+            </a:graphic>
+          </wp:inline>
+        </w:drawing>
+      </w:r>
+    </w:p>
+    <w:p>
+      <w:pPr>
+        <w:spacing w:after="160"/>
+        <w:jc w:val="center"/>
+      </w:pPr>
+      <w:r>
+        <w:rPr>
+          <w:i/>
+          <w:iCs/>
+          <w:color w:val="595959"/>
+          <w:sz w:val="18"/>
+          <w:szCs w:val="18"/>
+        </w:rPr>
+        <w:t xml:space="preserve">The step 3 output: each object classified take-straight or to-merge, with the reason, and the run summary.</w:t>
+      </w:r>
+    </w:p>
+    <w:p>
+      <w:pPr>
+        <w:spacing w:after="40" w:before="120"/>
+        <w:jc w:val="center"/>
+      </w:pPr>
+      <w:r>
+        <w:drawing>
+          <wp:inline distT="0" distB="0" distL="0" distR="0">
+            <wp:extent cx="4572000" cy="299493460575"/>
+            <wp:effectExtent t="0" r="0" b="0" l="0"/>
+            <wp:docPr id="1" name="" descr="" title=""/>
+            <wp:cNvGraphicFramePr>
+              <a:graphicFrameLocks xmlns:a="http://schemas.openxmlformats.org/drawingml/2006/main" noChangeAspect="1"/>
+            </wp:cNvGraphicFramePr>
+            <a:graphic xmlns:a="http://schemas.openxmlformats.org/drawingml/2006/main">
+              <a:graphicData uri="http://schemas.openxmlformats.org/drawingml/2006/picture">
+                <pic:pic xmlns:pic="http://schemas.openxmlformats.org/drawingml/2006/picture">
+                  <pic:nvPicPr>
+                    <pic:cNvPr id="0" name="" descr=""/>
+                    <pic:cNvPicPr>
+                      <a:picLocks noChangeAspect="1" noChangeArrowheads="1"/>
+                    </pic:cNvPicPr>
+                  </pic:nvPicPr>
+                  <pic:blipFill>
+                    <a:blip r:embed="rId17" cstate="none"/>
+                    <a:srcRect/>
+                    <a:stretch>
+                      <a:fillRect/>
+                    </a:stretch>
+                  </pic:blipFill>
+                  <pic:spPr bwMode="auto">
+                    <a:xfrm>
+                      <a:off x="0" y="0"/>
+                      <a:ext cx="4572000" cy="299493460575"/>
+                    </a:xfrm>
+                    <a:prstGeom prst="rect">
+                      <a:avLst/>
+                    </a:prstGeom>
+                  </pic:spPr>
+                </pic:pic>
+              </a:graphicData>
+            </a:graphic>
+          </wp:inline>
+        </w:drawing>
+      </w:r>
+    </w:p>
+    <w:p>
+      <w:pPr>
+        <w:spacing w:after="160"/>
+        <w:jc w:val="center"/>
+      </w:pPr>
+      <w:r>
+        <w:rPr>
+          <w:i/>
+          <w:iCs/>
+          <w:color w:val="595959"/>
+          <w:sz w:val="18"/>
+          <w:szCs w:val="18"/>
+        </w:rPr>
+        <w:t xml:space="preserve">The treatment report (&lt;CU&gt;_treatment.txt) written to the job root.</w:t>
+      </w:r>
+    </w:p>
+    <w:p>
+      <w:pPr>
         <w:pStyle w:val="Heading2"/>
       </w:pPr>
       <w:bookmarkStart w:id="9010" w:name="_Toc_cu_10"/>
@@ -1509,6 +2067,298 @@
       </w:r>
       <w:r>
         <w:t xml:space="preserve"> (vendor) — then runs CUupdate's batch driver over them. CUupdate applies its own merge rules and decides auto-merge vs manual review per object, using the merge parameters (CU token, initials, date, date format) from the panel.</w:t>
+      </w:r>
+    </w:p>
+    <w:p>
+      <w:pPr>
+        <w:spacing w:after="40" w:before="120"/>
+        <w:jc w:val="center"/>
+      </w:pPr>
+      <w:r>
+        <w:drawing>
+          <wp:inline distT="0" distB="0" distL="0" distR="0">
+            <wp:extent cx="4572000" cy="299493460575"/>
+            <wp:effectExtent t="0" r="0" b="0" l="0"/>
+            <wp:docPr id="1" name="" descr="" title=""/>
+            <wp:cNvGraphicFramePr>
+              <a:graphicFrameLocks xmlns:a="http://schemas.openxmlformats.org/drawingml/2006/main" noChangeAspect="1"/>
+            </wp:cNvGraphicFramePr>
+            <a:graphic xmlns:a="http://schemas.openxmlformats.org/drawingml/2006/main">
+              <a:graphicData uri="http://schemas.openxmlformats.org/drawingml/2006/picture">
+                <pic:pic xmlns:pic="http://schemas.openxmlformats.org/drawingml/2006/picture">
+                  <pic:nvPicPr>
+                    <pic:cNvPr id="0" name="" descr=""/>
+                    <pic:cNvPicPr>
+                      <a:picLocks noChangeAspect="1" noChangeArrowheads="1"/>
+                    </pic:cNvPicPr>
+                  </pic:nvPicPr>
+                  <pic:blipFill>
+                    <a:blip r:embed="rId18" cstate="none"/>
+                    <a:srcRect/>
+                    <a:stretch>
+                      <a:fillRect/>
+                    </a:stretch>
+                  </pic:blipFill>
+                  <pic:spPr bwMode="auto">
+                    <a:xfrm>
+                      <a:off x="0" y="0"/>
+                      <a:ext cx="4572000" cy="299493460575"/>
+                    </a:xfrm>
+                    <a:prstGeom prst="rect">
+                      <a:avLst/>
+                    </a:prstGeom>
+                  </pic:spPr>
+                </pic:pic>
+              </a:graphicData>
+            </a:graphic>
+          </wp:inline>
+        </w:drawing>
+      </w:r>
+    </w:p>
+    <w:p>
+      <w:pPr>
+        <w:spacing w:after="160"/>
+        <w:jc w:val="center"/>
+      </w:pPr>
+      <w:r>
+        <w:rPr>
+          <w:i/>
+          <w:iCs/>
+          <w:color w:val="595959"/>
+          <w:sz w:val="18"/>
+          <w:szCs w:val="18"/>
+        </w:rPr>
+        <w:t xml:space="preserve">Step 4 creates the staging and output folders under the job root: A/ and B/ (the merge inputs), AautoMerged/ and BautoMerged/, and Merged/ (the results).</w:t>
+      </w:r>
+    </w:p>
+    <w:p>
+      <w:pPr>
+        <w:spacing w:after="40" w:before="120"/>
+        <w:jc w:val="center"/>
+      </w:pPr>
+      <w:r>
+        <w:drawing>
+          <wp:inline distT="0" distB="0" distL="0" distR="0">
+            <wp:extent cx="4572000" cy="299493460575"/>
+            <wp:effectExtent t="0" r="0" b="0" l="0"/>
+            <wp:docPr id="1" name="" descr="" title=""/>
+            <wp:cNvGraphicFramePr>
+              <a:graphicFrameLocks xmlns:a="http://schemas.openxmlformats.org/drawingml/2006/main" noChangeAspect="1"/>
+            </wp:cNvGraphicFramePr>
+            <a:graphic xmlns:a="http://schemas.openxmlformats.org/drawingml/2006/main">
+              <a:graphicData uri="http://schemas.openxmlformats.org/drawingml/2006/picture">
+                <pic:pic xmlns:pic="http://schemas.openxmlformats.org/drawingml/2006/picture">
+                  <pic:nvPicPr>
+                    <pic:cNvPr id="0" name="" descr=""/>
+                    <pic:cNvPicPr>
+                      <a:picLocks noChangeAspect="1" noChangeArrowheads="1"/>
+                    </pic:cNvPicPr>
+                  </pic:nvPicPr>
+                  <pic:blipFill>
+                    <a:blip r:embed="rId19" cstate="none"/>
+                    <a:srcRect/>
+                    <a:stretch>
+                      <a:fillRect/>
+                    </a:stretch>
+                  </pic:blipFill>
+                  <pic:spPr bwMode="auto">
+                    <a:xfrm>
+                      <a:off x="0" y="0"/>
+                      <a:ext cx="4572000" cy="299493460575"/>
+                    </a:xfrm>
+                    <a:prstGeom prst="rect">
+                      <a:avLst/>
+                    </a:prstGeom>
+                  </pic:spPr>
+                </pic:pic>
+              </a:graphicData>
+            </a:graphic>
+          </wp:inline>
+        </w:drawing>
+      </w:r>
+    </w:p>
+    <w:p>
+      <w:pPr>
+        <w:spacing w:after="160"/>
+        <w:jc w:val="center"/>
+      </w:pPr>
+      <w:r>
+        <w:rPr>
+          <w:i/>
+          <w:iCs/>
+          <w:color w:val="595959"/>
+          <w:sz w:val="18"/>
+          <w:szCs w:val="18"/>
+        </w:rPr>
+        <w:t xml:space="preserve">The step 4 output: auto-merged objects, any with no CU change, and the objects gated to manual review with the reason and line for each block.</w:t>
+      </w:r>
+    </w:p>
+    <w:p>
+      <w:pPr>
+        <w:spacing w:after="120"/>
+      </w:pPr>
+      <w:r>
+        <w:t xml:space="preserve">Objects gated to manual review are left in </w:t>
+      </w:r>
+      <w:r>
+        <w:rPr>
+          <w:rFonts w:ascii="Consolas" w:cs="Consolas" w:eastAsia="Consolas" w:hAnsi="Consolas"/>
+        </w:rPr>
+        <w:t xml:space="preserve">A/</w:t>
+      </w:r>
+      <w:r>
+        <w:t xml:space="preserve"> and </w:t>
+      </w:r>
+      <w:r>
+        <w:rPr>
+          <w:rFonts w:ascii="Consolas" w:cs="Consolas" w:eastAsia="Consolas" w:hAnsi="Consolas"/>
+        </w:rPr>
+        <w:t xml:space="preserve">B/</w:t>
+      </w:r>
+      <w:r>
+        <w:t xml:space="preserve"> for you to hand-merge. Open the customer (</w:t>
+      </w:r>
+      <w:r>
+        <w:rPr>
+          <w:rFonts w:ascii="Consolas" w:cs="Consolas" w:eastAsia="Consolas" w:hAnsi="Consolas"/>
+        </w:rPr>
+        <w:t xml:space="preserve">A/</w:t>
+      </w:r>
+      <w:r>
+        <w:t xml:space="preserve">, base) and vendor (</w:t>
+      </w:r>
+      <w:r>
+        <w:rPr>
+          <w:rFonts w:ascii="Consolas" w:cs="Consolas" w:eastAsia="Consolas" w:hAnsi="Consolas"/>
+        </w:rPr>
+        <w:t xml:space="preserve">B/</w:t>
+      </w:r>
+      <w:r>
+        <w:t xml:space="preserve">, theirs) versions in a merge tool and resolve the flagged blocks by hand.</w:t>
+      </w:r>
+    </w:p>
+    <w:p>
+      <w:pPr>
+        <w:spacing w:after="40" w:before="120"/>
+        <w:jc w:val="center"/>
+      </w:pPr>
+      <w:r>
+        <w:drawing>
+          <wp:inline distT="0" distB="0" distL="0" distR="0">
+            <wp:extent cx="4572000" cy="299493460575"/>
+            <wp:effectExtent t="0" r="0" b="0" l="0"/>
+            <wp:docPr id="1" name="" descr="" title=""/>
+            <wp:cNvGraphicFramePr>
+              <a:graphicFrameLocks xmlns:a="http://schemas.openxmlformats.org/drawingml/2006/main" noChangeAspect="1"/>
+            </wp:cNvGraphicFramePr>
+            <a:graphic xmlns:a="http://schemas.openxmlformats.org/drawingml/2006/main">
+              <a:graphicData uri="http://schemas.openxmlformats.org/drawingml/2006/picture">
+                <pic:pic xmlns:pic="http://schemas.openxmlformats.org/drawingml/2006/picture">
+                  <pic:nvPicPr>
+                    <pic:cNvPr id="0" name="" descr=""/>
+                    <pic:cNvPicPr>
+                      <a:picLocks noChangeAspect="1" noChangeArrowheads="1"/>
+                    </pic:cNvPicPr>
+                  </pic:nvPicPr>
+                  <pic:blipFill>
+                    <a:blip r:embed="rId20" cstate="none"/>
+                    <a:srcRect/>
+                    <a:stretch>
+                      <a:fillRect/>
+                    </a:stretch>
+                  </pic:blipFill>
+                  <pic:spPr bwMode="auto">
+                    <a:xfrm>
+                      <a:off x="0" y="0"/>
+                      <a:ext cx="4572000" cy="299493460575"/>
+                    </a:xfrm>
+                    <a:prstGeom prst="rect">
+                      <a:avLst/>
+                    </a:prstGeom>
+                  </pic:spPr>
+                </pic:pic>
+              </a:graphicData>
+            </a:graphic>
+          </wp:inline>
+        </w:drawing>
+      </w:r>
+    </w:p>
+    <w:p>
+      <w:pPr>
+        <w:spacing w:after="160"/>
+        <w:jc w:val="center"/>
+      </w:pPr>
+      <w:r>
+        <w:rPr>
+          <w:i/>
+          <w:iCs/>
+          <w:color w:val="595959"/>
+          <w:sz w:val="18"/>
+          <w:szCs w:val="18"/>
+        </w:rPr>
+        <w:t xml:space="preserve">Hand-merging a gated object in TortoiseMerge: A/ is the base (customer) file, B/ is their (vendor) file.</w:t>
+      </w:r>
+    </w:p>
+    <w:p>
+      <w:pPr>
+        <w:spacing w:after="40" w:before="120"/>
+        <w:jc w:val="center"/>
+      </w:pPr>
+      <w:r>
+        <w:drawing>
+          <wp:inline distT="0" distB="0" distL="0" distR="0">
+            <wp:extent cx="4572000" cy="299493460575"/>
+            <wp:effectExtent t="0" r="0" b="0" l="0"/>
+            <wp:docPr id="1" name="" descr="" title=""/>
+            <wp:cNvGraphicFramePr>
+              <a:graphicFrameLocks xmlns:a="http://schemas.openxmlformats.org/drawingml/2006/main" noChangeAspect="1"/>
+            </wp:cNvGraphicFramePr>
+            <a:graphic xmlns:a="http://schemas.openxmlformats.org/drawingml/2006/main">
+              <a:graphicData uri="http://schemas.openxmlformats.org/drawingml/2006/picture">
+                <pic:pic xmlns:pic="http://schemas.openxmlformats.org/drawingml/2006/picture">
+                  <pic:nvPicPr>
+                    <pic:cNvPr id="0" name="" descr=""/>
+                    <pic:cNvPicPr>
+                      <a:picLocks noChangeAspect="1" noChangeArrowheads="1"/>
+                    </pic:cNvPicPr>
+                  </pic:nvPicPr>
+                  <pic:blipFill>
+                    <a:blip r:embed="rId21" cstate="none"/>
+                    <a:srcRect/>
+                    <a:stretch>
+                      <a:fillRect/>
+                    </a:stretch>
+                  </pic:blipFill>
+                  <pic:spPr bwMode="auto">
+                    <a:xfrm>
+                      <a:off x="0" y="0"/>
+                      <a:ext cx="4572000" cy="299493460575"/>
+                    </a:xfrm>
+                    <a:prstGeom prst="rect">
+                      <a:avLst/>
+                    </a:prstGeom>
+                  </pic:spPr>
+                </pic:pic>
+              </a:graphicData>
+            </a:graphic>
+          </wp:inline>
+        </w:drawing>
+      </w:r>
+    </w:p>
+    <w:p>
+      <w:pPr>
+        <w:spacing w:after="160"/>
+        <w:jc w:val="center"/>
+      </w:pPr>
+      <w:r>
+        <w:rPr>
+          <w:i/>
+          <w:iCs/>
+          <w:color w:val="595959"/>
+          <w:sz w:val="18"/>
+          <w:szCs w:val="18"/>
+        </w:rPr>
+        <w:t xml:space="preserve">Save each completed hand-merge into the Merged/&lt;Type&gt;/ folder as Merged-&lt;key&gt;.txt so step 5 picks it up.</w:t>
       </w:r>
     </w:p>
     <w:p>
@@ -1550,6 +2400,68 @@
     </w:p>
     <w:p>
       <w:pPr>
+        <w:spacing w:after="40" w:before="120"/>
+        <w:jc w:val="center"/>
+      </w:pPr>
+      <w:r>
+        <w:drawing>
+          <wp:inline distT="0" distB="0" distL="0" distR="0">
+            <wp:extent cx="4572000" cy="299493460575"/>
+            <wp:effectExtent t="0" r="0" b="0" l="0"/>
+            <wp:docPr id="1" name="" descr="" title=""/>
+            <wp:cNvGraphicFramePr>
+              <a:graphicFrameLocks xmlns:a="http://schemas.openxmlformats.org/drawingml/2006/main" noChangeAspect="1"/>
+            </wp:cNvGraphicFramePr>
+            <a:graphic xmlns:a="http://schemas.openxmlformats.org/drawingml/2006/main">
+              <a:graphicData uri="http://schemas.openxmlformats.org/drawingml/2006/picture">
+                <pic:pic xmlns:pic="http://schemas.openxmlformats.org/drawingml/2006/picture">
+                  <pic:nvPicPr>
+                    <pic:cNvPr id="0" name="" descr=""/>
+                    <pic:cNvPicPr>
+                      <a:picLocks noChangeAspect="1" noChangeArrowheads="1"/>
+                    </pic:cNvPicPr>
+                  </pic:nvPicPr>
+                  <pic:blipFill>
+                    <a:blip r:embed="rId22" cstate="none"/>
+                    <a:srcRect/>
+                    <a:stretch>
+                      <a:fillRect/>
+                    </a:stretch>
+                  </pic:blipFill>
+                  <pic:spPr bwMode="auto">
+                    <a:xfrm>
+                      <a:off x="0" y="0"/>
+                      <a:ext cx="4572000" cy="299493460575"/>
+                    </a:xfrm>
+                    <a:prstGeom prst="rect">
+                      <a:avLst/>
+                    </a:prstGeom>
+                  </pic:spPr>
+                </pic:pic>
+              </a:graphicData>
+            </a:graphic>
+          </wp:inline>
+        </w:drawing>
+      </w:r>
+    </w:p>
+    <w:p>
+      <w:pPr>
+        <w:spacing w:after="160"/>
+        <w:jc w:val="center"/>
+      </w:pPr>
+      <w:r>
+        <w:rPr>
+          <w:i/>
+          <w:iCs/>
+          <w:color w:val="595959"/>
+          <w:sz w:val="18"/>
+          <w:szCs w:val="18"/>
+        </w:rPr>
+        <w:t xml:space="preserve">The Import folder after step 5: take-straight vendor objects (CU-) alongside the auto-merged outputs (Merged-).</w:t>
+      </w:r>
+    </w:p>
+    <w:p>
+      <w:pPr>
         <w:pStyle w:val="Heading2"/>
       </w:pPr>
       <w:bookmarkStart w:id="9012" w:name="_Toc_cu_12"/>
@@ -1627,6 +2539,68 @@
       </w:r>
       <w:r>
         <w:t xml:space="preserve"> folder is imported, regardless of any objects still flagged manual-required from step 5 — so you can import the ready set and add the hand-merged objects in a later pass. The step asks for confirmation first, showing the folder and target database. It runs under Windows authentication; no credentials are entered or stored.</w:t>
+      </w:r>
+    </w:p>
+    <w:p>
+      <w:pPr>
+        <w:spacing w:after="40" w:before="120"/>
+        <w:jc w:val="center"/>
+      </w:pPr>
+      <w:r>
+        <w:drawing>
+          <wp:inline distT="0" distB="0" distL="0" distR="0">
+            <wp:extent cx="4572000" cy="299493460575"/>
+            <wp:effectExtent t="0" r="0" b="0" l="0"/>
+            <wp:docPr id="1" name="" descr="" title=""/>
+            <wp:cNvGraphicFramePr>
+              <a:graphicFrameLocks xmlns:a="http://schemas.openxmlformats.org/drawingml/2006/main" noChangeAspect="1"/>
+            </wp:cNvGraphicFramePr>
+            <a:graphic xmlns:a="http://schemas.openxmlformats.org/drawingml/2006/main">
+              <a:graphicData uri="http://schemas.openxmlformats.org/drawingml/2006/picture">
+                <pic:pic xmlns:pic="http://schemas.openxmlformats.org/drawingml/2006/picture">
+                  <pic:nvPicPr>
+                    <pic:cNvPr id="0" name="" descr=""/>
+                    <pic:cNvPicPr>
+                      <a:picLocks noChangeAspect="1" noChangeArrowheads="1"/>
+                    </pic:cNvPicPr>
+                  </pic:nvPicPr>
+                  <pic:blipFill>
+                    <a:blip r:embed="rId23" cstate="none"/>
+                    <a:srcRect/>
+                    <a:stretch>
+                      <a:fillRect/>
+                    </a:stretch>
+                  </pic:blipFill>
+                  <pic:spPr bwMode="auto">
+                    <a:xfrm>
+                      <a:off x="0" y="0"/>
+                      <a:ext cx="4572000" cy="299493460575"/>
+                    </a:xfrm>
+                    <a:prstGeom prst="rect">
+                      <a:avLst/>
+                    </a:prstGeom>
+                  </pic:spPr>
+                </pic:pic>
+              </a:graphicData>
+            </a:graphic>
+          </wp:inline>
+        </w:drawing>
+      </w:r>
+    </w:p>
+    <w:p>
+      <w:pPr>
+        <w:spacing w:after="160"/>
+        <w:jc w:val="center"/>
+      </w:pPr>
+      <w:r>
+        <w:rPr>
+          <w:i/>
+          <w:iCs/>
+          <w:color w:val="595959"/>
+          <w:sz w:val="18"/>
+          <w:szCs w:val="18"/>
+        </w:rPr>
+        <w:t xml:space="preserve">Step 6 asks for confirmation, showing the import folder and target database, before joining and importing.</w:t>
       </w:r>
     </w:p>
     <w:p>

</xml_diff>